<commit_message>
adding translation to frontend
</commit_message>
<xml_diff>
--- a/Presentations/Streaming Churn Analysis and Prediction.docx
+++ b/Presentations/Streaming Churn Analysis and Prediction.docx
@@ -155,36 +155,14 @@
         <w:rPr>
           <w:lang w:val="en-US"/>
         </w:rPr>
-        <w:t xml:space="preserve">Python, PostgreSQL, psycopg2, </w:t>
-      </w:r>
-      <w:proofErr w:type="spellStart"/>
-      <w:r>
-        <w:rPr>
-          <w:lang w:val="en-US"/>
-        </w:rPr>
-        <w:t>SQLAlchemy</w:t>
-      </w:r>
-      <w:proofErr w:type="spellEnd"/>
-      <w:r>
-        <w:rPr>
-          <w:lang w:val="en-US"/>
-        </w:rPr>
-        <w:t>, pandas, seaborn, matplotlib</w:t>
-      </w:r>
-      <w:r>
-        <w:rPr>
-          <w:lang w:val="en-US"/>
-        </w:rPr>
-        <w:t xml:space="preserve">, </w:t>
-      </w:r>
-      <w:proofErr w:type="spellStart"/>
-      <w:r>
-        <w:rPr>
-          <w:lang w:val="en-US"/>
-        </w:rPr>
-        <w:t>DBeaver</w:t>
-      </w:r>
-      <w:proofErr w:type="spellEnd"/>
+        <w:t>Python, PostgreSQL, psycopg2, SQLAlchemy, pandas, seaborn, matplotlib</w:t>
+      </w:r>
+      <w:r>
+        <w:rPr>
+          <w:lang w:val="en-US"/>
+        </w:rPr>
+        <w:t>, DBeaver</w:t>
+      </w:r>
     </w:p>
     <w:p>
       <w:pPr>
@@ -224,21 +202,7 @@
         <w:rPr>
           <w:lang w:val="en-US"/>
         </w:rPr>
-        <w:t xml:space="preserve">The project uses a PostgreSQL database with 6 normalized tables; all connected via </w:t>
-      </w:r>
-      <w:proofErr w:type="spellStart"/>
-      <w:r>
-        <w:rPr>
-          <w:lang w:val="en-US"/>
-        </w:rPr>
-        <w:t>user_id</w:t>
-      </w:r>
-      <w:proofErr w:type="spellEnd"/>
-      <w:r>
-        <w:rPr>
-          <w:lang w:val="en-US"/>
-        </w:rPr>
-        <w:t xml:space="preserve"> foreign key. The database was designed to separate concerns clearly – user demographics, subscription info, engagement behavior, support history, billing, and churn labels are each stored independently.</w:t>
+        <w:t>The project uses a PostgreSQL database with 6 normalized tables; all connected via user_id foreign key. The database was designed to separate concerns clearly – user demographics, subscription info, engagement behavior, support history, billing, and churn labels are each stored independently.</w:t>
       </w:r>
     </w:p>
     <w:p>
@@ -352,21 +316,7 @@
         <w:rPr>
           <w:lang w:val="en-US"/>
         </w:rPr>
-        <w:t xml:space="preserve"> - </w:t>
-      </w:r>
-      <w:proofErr w:type="spellStart"/>
-      <w:r>
-        <w:rPr>
-          <w:lang w:val="en-US"/>
-        </w:rPr>
-        <w:t>DBeaver</w:t>
-      </w:r>
-      <w:proofErr w:type="spellEnd"/>
-      <w:r>
-        <w:rPr>
-          <w:lang w:val="en-US"/>
-        </w:rPr>
-        <w:t xml:space="preserve"> was used to make the schema visualization</w:t>
+        <w:t xml:space="preserve"> - DBeaver was used to make the schema visualization</w:t>
       </w:r>
     </w:p>
     <w:tbl>
@@ -462,7 +412,6 @@
                 <w:lang w:val="en-US"/>
               </w:rPr>
             </w:pPr>
-            <w:proofErr w:type="spellStart"/>
             <w:r>
               <w:rPr>
                 <w:lang w:val="en-US"/>
@@ -473,21 +422,7 @@
               <w:rPr>
                 <w:lang w:val="en-US"/>
               </w:rPr>
-              <w:t>ser_id</w:t>
-            </w:r>
-            <w:proofErr w:type="spellEnd"/>
-            <w:r>
-              <w:rPr>
-                <w:lang w:val="en-US"/>
-              </w:rPr>
-              <w:t xml:space="preserve"> (</w:t>
-            </w:r>
-            <w:proofErr w:type="gramStart"/>
-            <w:r>
-              <w:rPr>
-                <w:lang w:val="en-US"/>
-              </w:rPr>
-              <w:t>PK)</w:t>
+              <w:t>ser_id (PK)</w:t>
             </w:r>
             <w:r>
               <w:rPr>
@@ -499,27 +434,37 @@
               <w:rPr>
                 <w:lang w:val="en-US"/>
               </w:rPr>
+              <w:t xml:space="preserve">· age </w:t>
+            </w:r>
+            <w:r>
+              <w:rPr>
+                <w:lang w:val="en-US"/>
+              </w:rPr>
+              <w:t xml:space="preserve">(INT) </w:t>
+            </w:r>
+            <w:r>
+              <w:rPr>
+                <w:lang w:val="en-US"/>
+              </w:rPr>
               <w:t>·</w:t>
             </w:r>
-            <w:proofErr w:type="gramEnd"/>
-            <w:r>
-              <w:rPr>
-                <w:lang w:val="en-US"/>
-              </w:rPr>
-              <w:t xml:space="preserve"> age </w:t>
-            </w:r>
-            <w:r>
-              <w:rPr>
-                <w:lang w:val="en-US"/>
-              </w:rPr>
-              <w:t>(</w:t>
-            </w:r>
-            <w:proofErr w:type="gramStart"/>
-            <w:r>
-              <w:rPr>
-                <w:lang w:val="en-US"/>
-              </w:rPr>
-              <w:t xml:space="preserve">INT) </w:t>
+            <w:r>
+              <w:rPr>
+                <w:lang w:val="en-US"/>
+              </w:rPr>
+              <w:t xml:space="preserve"> </w:t>
+            </w:r>
+            <w:r>
+              <w:rPr>
+                <w:lang w:val="en-US"/>
+              </w:rPr>
+              <w:t>c</w:t>
+            </w:r>
+            <w:r>
+              <w:rPr>
+                <w:lang w:val="en-US"/>
+              </w:rPr>
+              <w:t xml:space="preserve">ountry (VARCHAR) </w:t>
             </w:r>
             <w:r>
               <w:rPr>
@@ -527,58 +472,11 @@
               </w:rPr>
               <w:t>·</w:t>
             </w:r>
-            <w:proofErr w:type="gramEnd"/>
-            <w:r>
-              <w:rPr>
-                <w:lang w:val="en-US"/>
-              </w:rPr>
-              <w:t xml:space="preserve"> </w:t>
-            </w:r>
-            <w:r>
-              <w:rPr>
-                <w:lang w:val="en-US"/>
-              </w:rPr>
-              <w:t>c</w:t>
-            </w:r>
-            <w:r>
-              <w:rPr>
-                <w:lang w:val="en-US"/>
-              </w:rPr>
-              <w:t>ountry (</w:t>
-            </w:r>
-            <w:proofErr w:type="gramStart"/>
-            <w:r>
-              <w:rPr>
-                <w:lang w:val="en-US"/>
-              </w:rPr>
-              <w:t xml:space="preserve">VARCHAR) </w:t>
-            </w:r>
-            <w:r>
-              <w:rPr>
-                <w:lang w:val="en-US"/>
-              </w:rPr>
-              <w:t>·</w:t>
-            </w:r>
-            <w:proofErr w:type="gramEnd"/>
-            <w:r>
-              <w:rPr>
-                <w:lang w:val="en-US"/>
-              </w:rPr>
-              <w:t xml:space="preserve"> </w:t>
-            </w:r>
-            <w:proofErr w:type="spellStart"/>
-            <w:r>
-              <w:rPr>
-                <w:lang w:val="en-US"/>
-              </w:rPr>
-              <w:t>signup_date</w:t>
-            </w:r>
-            <w:proofErr w:type="spellEnd"/>
-            <w:r>
-              <w:rPr>
-                <w:lang w:val="en-US"/>
-              </w:rPr>
-              <w:t xml:space="preserve"> (DATE)</w:t>
+            <w:r>
+              <w:rPr>
+                <w:lang w:val="en-US"/>
+              </w:rPr>
+              <w:t xml:space="preserve"> signup_date (DATE)</w:t>
             </w:r>
           </w:p>
         </w:tc>
@@ -614,45 +512,23 @@
                 <w:lang w:val="en-US"/>
               </w:rPr>
             </w:pPr>
-            <w:proofErr w:type="spellStart"/>
-            <w:r>
-              <w:rPr>
-                <w:lang w:val="en-US"/>
-              </w:rPr>
-              <w:t>subscription_id</w:t>
-            </w:r>
-            <w:proofErr w:type="spellEnd"/>
-            <w:r>
-              <w:rPr>
-                <w:lang w:val="en-US"/>
-              </w:rPr>
-              <w:t xml:space="preserve"> (PK) </w:t>
-            </w:r>
-            <w:r>
-              <w:rPr>
-                <w:lang w:val="en-US"/>
-              </w:rPr>
-              <w:t xml:space="preserve">· </w:t>
-            </w:r>
-            <w:proofErr w:type="spellStart"/>
-            <w:r>
-              <w:rPr>
-                <w:lang w:val="en-US"/>
-              </w:rPr>
-              <w:t>user_i</w:t>
-            </w:r>
-            <w:r>
-              <w:rPr>
-                <w:lang w:val="en-US"/>
-              </w:rPr>
-              <w:t>d</w:t>
-            </w:r>
-            <w:proofErr w:type="spellEnd"/>
-            <w:r>
-              <w:rPr>
-                <w:lang w:val="en-US"/>
-              </w:rPr>
-              <w:t xml:space="preserve"> (FK) </w:t>
+            <w:r>
+              <w:rPr>
+                <w:lang w:val="en-US"/>
+              </w:rPr>
+              <w:t xml:space="preserve">subscription_id (PK) </w:t>
+            </w:r>
+            <w:r>
+              <w:rPr>
+                <w:lang w:val="en-US"/>
+              </w:rPr>
+              <w:t>· user_i</w:t>
+            </w:r>
+            <w:r>
+              <w:rPr>
+                <w:lang w:val="en-US"/>
+              </w:rPr>
+              <w:t xml:space="preserve">d (FK) </w:t>
             </w:r>
             <w:r>
               <w:rPr>
@@ -676,28 +552,20 @@
               <w:rPr>
                 <w:lang w:val="en-US"/>
               </w:rPr>
+              <w:t xml:space="preserve"> monthly_price</w:t>
+            </w:r>
+            <w:r>
+              <w:rPr>
+                <w:lang w:val="en-US"/>
+              </w:rPr>
+              <w:t xml:space="preserve"> (NUMERIC)</w:t>
+            </w:r>
+            <w:r>
+              <w:rPr>
+                <w:lang w:val="en-US"/>
+              </w:rPr>
               <w:t xml:space="preserve"> </w:t>
             </w:r>
-            <w:proofErr w:type="spellStart"/>
-            <w:r>
-              <w:rPr>
-                <w:lang w:val="en-US"/>
-              </w:rPr>
-              <w:t>monthly_price</w:t>
-            </w:r>
-            <w:proofErr w:type="spellEnd"/>
-            <w:r>
-              <w:rPr>
-                <w:lang w:val="en-US"/>
-              </w:rPr>
-              <w:t xml:space="preserve"> (NUMERIC)</w:t>
-            </w:r>
-            <w:r>
-              <w:rPr>
-                <w:lang w:val="en-US"/>
-              </w:rPr>
-              <w:t xml:space="preserve"> </w:t>
-            </w:r>
             <w:r>
               <w:rPr>
                 <w:lang w:val="en-US"/>
@@ -708,16 +576,8 @@
               <w:rPr>
                 <w:lang w:val="en-US"/>
               </w:rPr>
-              <w:t xml:space="preserve"> </w:t>
-            </w:r>
-            <w:proofErr w:type="spellStart"/>
-            <w:r>
-              <w:rPr>
-                <w:lang w:val="en-US"/>
-              </w:rPr>
-              <w:t>start_date</w:t>
-            </w:r>
-            <w:proofErr w:type="spellEnd"/>
+              <w:t xml:space="preserve"> start_date</w:t>
+            </w:r>
             <w:r>
               <w:rPr>
                 <w:lang w:val="en-US"/>
@@ -761,19 +621,11 @@
                 <w:lang w:val="en-US"/>
               </w:rPr>
             </w:pPr>
-            <w:proofErr w:type="spellStart"/>
-            <w:r>
-              <w:rPr>
-                <w:lang w:val="en-US"/>
-              </w:rPr>
-              <w:t>engagement_id</w:t>
-            </w:r>
-            <w:proofErr w:type="spellEnd"/>
-            <w:r>
-              <w:rPr>
-                <w:lang w:val="en-US"/>
-              </w:rPr>
-              <w:t xml:space="preserve"> (PK) </w:t>
+            <w:r>
+              <w:rPr>
+                <w:lang w:val="en-US"/>
+              </w:rPr>
+              <w:t xml:space="preserve">engagement_id (PK) </w:t>
             </w:r>
             <w:r>
               <w:rPr>
@@ -785,21 +637,50 @@
               <w:rPr>
                 <w:lang w:val="en-US"/>
               </w:rPr>
+              <w:t xml:space="preserve"> user_id (FK) </w:t>
+            </w:r>
+            <w:r>
+              <w:rPr>
+                <w:lang w:val="en-US"/>
+              </w:rPr>
+              <w:t>·</w:t>
+            </w:r>
+            <w:r>
+              <w:rPr>
+                <w:lang w:val="en-US"/>
+              </w:rPr>
+              <w:t xml:space="preserve"> avg_watch_hours_per_week </w:t>
+            </w:r>
+            <w:r>
+              <w:rPr>
+                <w:lang w:val="en-US"/>
+              </w:rPr>
+              <w:t xml:space="preserve">(NUMERIC) </w:t>
+            </w:r>
+            <w:r>
+              <w:rPr>
+                <w:lang w:val="en-US"/>
+              </w:rPr>
+              <w:t>·</w:t>
+            </w:r>
+            <w:r>
+              <w:rPr>
+                <w:lang w:val="en-US"/>
+              </w:rPr>
               <w:t xml:space="preserve"> </w:t>
             </w:r>
-            <w:proofErr w:type="spellStart"/>
-            <w:r>
-              <w:rPr>
-                <w:lang w:val="en-US"/>
-              </w:rPr>
-              <w:t>user_id</w:t>
-            </w:r>
-            <w:proofErr w:type="spellEnd"/>
-            <w:r>
-              <w:rPr>
-                <w:lang w:val="en-US"/>
-              </w:rPr>
-              <w:t xml:space="preserve"> (FK) </w:t>
+            <w:r>
+              <w:rPr>
+                <w:lang w:val="en-US"/>
+              </w:rPr>
+              <w:lastRenderedPageBreak/>
+              <w:t xml:space="preserve">number_of_logins_per_week </w:t>
+            </w:r>
+            <w:r>
+              <w:rPr>
+                <w:lang w:val="en-US"/>
+              </w:rPr>
+              <w:t xml:space="preserve">(INT) </w:t>
             </w:r>
             <w:r>
               <w:rPr>
@@ -811,27 +692,13 @@
               <w:rPr>
                 <w:lang w:val="en-US"/>
               </w:rPr>
-              <w:t xml:space="preserve"> </w:t>
-            </w:r>
-            <w:proofErr w:type="spellStart"/>
-            <w:r>
-              <w:rPr>
-                <w:lang w:val="en-US"/>
-              </w:rPr>
-              <w:t>avg_watch_hours_per_week</w:t>
-            </w:r>
-            <w:proofErr w:type="spellEnd"/>
-            <w:r>
-              <w:rPr>
-                <w:lang w:val="en-US"/>
-              </w:rPr>
-              <w:t xml:space="preserve"> </w:t>
-            </w:r>
-            <w:r>
-              <w:rPr>
-                <w:lang w:val="en-US"/>
-              </w:rPr>
-              <w:t xml:space="preserve">(NUMERIC) </w:t>
+              <w:t xml:space="preserve"> days_since_last_watch </w:t>
+            </w:r>
+            <w:r>
+              <w:rPr>
+                <w:lang w:val="en-US"/>
+              </w:rPr>
+              <w:t xml:space="preserve">(INT) </w:t>
             </w:r>
             <w:r>
               <w:rPr>
@@ -843,81 +710,8 @@
               <w:rPr>
                 <w:lang w:val="en-US"/>
               </w:rPr>
-              <w:t xml:space="preserve"> </w:t>
-            </w:r>
-            <w:proofErr w:type="spellStart"/>
-            <w:r>
-              <w:rPr>
-                <w:lang w:val="en-US"/>
-              </w:rPr>
-              <w:lastRenderedPageBreak/>
-              <w:t>number_of_logins_per_week</w:t>
-            </w:r>
-            <w:proofErr w:type="spellEnd"/>
-            <w:r>
-              <w:rPr>
-                <w:lang w:val="en-US"/>
-              </w:rPr>
-              <w:t xml:space="preserve"> </w:t>
-            </w:r>
-            <w:r>
-              <w:rPr>
-                <w:lang w:val="en-US"/>
-              </w:rPr>
-              <w:t xml:space="preserve">(INT) </w:t>
-            </w:r>
-            <w:r>
-              <w:rPr>
-                <w:lang w:val="en-US"/>
-              </w:rPr>
-              <w:t>·</w:t>
-            </w:r>
-            <w:r>
-              <w:rPr>
-                <w:lang w:val="en-US"/>
-              </w:rPr>
-              <w:t xml:space="preserve"> </w:t>
-            </w:r>
-            <w:proofErr w:type="spellStart"/>
-            <w:r>
-              <w:rPr>
-                <w:lang w:val="en-US"/>
-              </w:rPr>
-              <w:t>days_since_last_watch</w:t>
-            </w:r>
-            <w:proofErr w:type="spellEnd"/>
-            <w:r>
-              <w:rPr>
-                <w:lang w:val="en-US"/>
-              </w:rPr>
-              <w:t xml:space="preserve"> </w:t>
-            </w:r>
-            <w:r>
-              <w:rPr>
-                <w:lang w:val="en-US"/>
-              </w:rPr>
-              <w:t xml:space="preserve">(INT) </w:t>
-            </w:r>
-            <w:r>
-              <w:rPr>
-                <w:lang w:val="en-US"/>
-              </w:rPr>
-              <w:t>·</w:t>
-            </w:r>
-            <w:r>
-              <w:rPr>
-                <w:lang w:val="en-US"/>
-              </w:rPr>
-              <w:t xml:space="preserve"> </w:t>
-            </w:r>
-            <w:proofErr w:type="spellStart"/>
-            <w:r>
-              <w:rPr>
-                <w:lang w:val="en-US"/>
-              </w:rPr>
-              <w:t>completion_rate</w:t>
-            </w:r>
-            <w:proofErr w:type="spellEnd"/>
+              <w:t xml:space="preserve"> completion_rate</w:t>
+            </w:r>
             <w:r>
               <w:rPr>
                 <w:lang w:val="en-US"/>
@@ -939,7 +733,6 @@
                 <w:lang w:val="en-US"/>
               </w:rPr>
             </w:pPr>
-            <w:proofErr w:type="spellStart"/>
             <w:r>
               <w:rPr>
                 <w:lang w:val="en-US"/>
@@ -947,7 +740,6 @@
               <w:lastRenderedPageBreak/>
               <w:t>support_tickets</w:t>
             </w:r>
-            <w:proofErr w:type="spellEnd"/>
           </w:p>
         </w:tc>
         <w:tc>
@@ -961,19 +753,11 @@
                 <w:lang w:val="en-US"/>
               </w:rPr>
             </w:pPr>
-            <w:proofErr w:type="spellStart"/>
-            <w:r>
-              <w:rPr>
-                <w:lang w:val="en-US"/>
-              </w:rPr>
-              <w:t>support_id</w:t>
-            </w:r>
-            <w:proofErr w:type="spellEnd"/>
-            <w:r>
-              <w:rPr>
-                <w:lang w:val="en-US"/>
-              </w:rPr>
-              <w:t xml:space="preserve"> (PK) </w:t>
+            <w:r>
+              <w:rPr>
+                <w:lang w:val="en-US"/>
+              </w:rPr>
+              <w:t xml:space="preserve">support_id (PK) </w:t>
             </w:r>
             <w:r>
               <w:rPr>
@@ -985,21 +769,7 @@
               <w:rPr>
                 <w:lang w:val="en-US"/>
               </w:rPr>
-              <w:t xml:space="preserve"> </w:t>
-            </w:r>
-            <w:proofErr w:type="spellStart"/>
-            <w:r>
-              <w:rPr>
-                <w:lang w:val="en-US"/>
-              </w:rPr>
-              <w:t>user_id</w:t>
-            </w:r>
-            <w:proofErr w:type="spellEnd"/>
-            <w:r>
-              <w:rPr>
-                <w:lang w:val="en-US"/>
-              </w:rPr>
-              <w:t xml:space="preserve"> (FK) </w:t>
+              <w:t xml:space="preserve"> user_id (FK) </w:t>
             </w:r>
             <w:r>
               <w:rPr>
@@ -1056,19 +826,11 @@
                 <w:lang w:val="en-US"/>
               </w:rPr>
             </w:pPr>
-            <w:proofErr w:type="spellStart"/>
-            <w:r>
-              <w:rPr>
-                <w:lang w:val="en-US"/>
-              </w:rPr>
-              <w:t>billing_id</w:t>
-            </w:r>
-            <w:proofErr w:type="spellEnd"/>
-            <w:r>
-              <w:rPr>
-                <w:lang w:val="en-US"/>
-              </w:rPr>
-              <w:t xml:space="preserve"> (PK) </w:t>
+            <w:r>
+              <w:rPr>
+                <w:lang w:val="en-US"/>
+              </w:rPr>
+              <w:t xml:space="preserve">billing_id (PK) </w:t>
             </w:r>
             <w:r>
               <w:rPr>
@@ -1080,22 +842,32 @@
               <w:rPr>
                 <w:lang w:val="en-US"/>
               </w:rPr>
+              <w:t xml:space="preserve"> user_id (FK) </w:t>
+            </w:r>
+            <w:r>
+              <w:rPr>
+                <w:lang w:val="en-US"/>
+              </w:rPr>
+              <w:t>·</w:t>
+            </w:r>
+            <w:r>
+              <w:rPr>
+                <w:lang w:val="en-US"/>
+              </w:rPr>
+              <w:t xml:space="preserve"> price_increase_last_6m</w:t>
+            </w:r>
+            <w:r>
+              <w:rPr>
+                <w:lang w:val="en-US"/>
+              </w:rPr>
+              <w:t xml:space="preserve"> (BOOLEAN)</w:t>
+            </w:r>
+            <w:r>
+              <w:rPr>
+                <w:lang w:val="en-US"/>
+              </w:rPr>
               <w:t xml:space="preserve"> </w:t>
             </w:r>
-            <w:proofErr w:type="spellStart"/>
-            <w:r>
-              <w:rPr>
-                <w:lang w:val="en-US"/>
-              </w:rPr>
-              <w:t>user_id</w:t>
-            </w:r>
-            <w:proofErr w:type="spellEnd"/>
-            <w:r>
-              <w:rPr>
-                <w:lang w:val="en-US"/>
-              </w:rPr>
-              <w:t xml:space="preserve"> (FK) </w:t>
-            </w:r>
             <w:r>
               <w:rPr>
                 <w:lang w:val="en-US"/>
@@ -1106,40 +878,8 @@
               <w:rPr>
                 <w:lang w:val="en-US"/>
               </w:rPr>
-              <w:t xml:space="preserve"> price_increase_last_6m</w:t>
-            </w:r>
-            <w:r>
-              <w:rPr>
-                <w:lang w:val="en-US"/>
-              </w:rPr>
-              <w:t xml:space="preserve"> (BOOLEAN)</w:t>
-            </w:r>
-            <w:r>
-              <w:rPr>
-                <w:lang w:val="en-US"/>
-              </w:rPr>
-              <w:t xml:space="preserve"> </w:t>
-            </w:r>
-            <w:r>
-              <w:rPr>
-                <w:lang w:val="en-US"/>
-              </w:rPr>
-              <w:t>·</w:t>
-            </w:r>
-            <w:r>
-              <w:rPr>
-                <w:lang w:val="en-US"/>
-              </w:rPr>
-              <w:t xml:space="preserve"> </w:t>
-            </w:r>
-            <w:proofErr w:type="spellStart"/>
-            <w:r>
-              <w:rPr>
-                <w:lang w:val="en-US"/>
-              </w:rPr>
-              <w:t>payment_failures</w:t>
-            </w:r>
-            <w:proofErr w:type="spellEnd"/>
+              <w:t xml:space="preserve"> payment_failures</w:t>
+            </w:r>
             <w:r>
               <w:rPr>
                 <w:lang w:val="en-US"/>
@@ -1161,14 +901,12 @@
                 <w:lang w:val="en-US"/>
               </w:rPr>
             </w:pPr>
-            <w:proofErr w:type="spellStart"/>
             <w:r>
               <w:rPr>
                 <w:lang w:val="en-US"/>
               </w:rPr>
               <w:t>churn_labels</w:t>
             </w:r>
-            <w:proofErr w:type="spellEnd"/>
           </w:p>
         </w:tc>
         <w:tc>
@@ -1182,19 +920,11 @@
                 <w:lang w:val="en-US"/>
               </w:rPr>
             </w:pPr>
-            <w:proofErr w:type="spellStart"/>
-            <w:r>
-              <w:rPr>
-                <w:lang w:val="en-US"/>
-              </w:rPr>
-              <w:t>churn_id</w:t>
-            </w:r>
-            <w:proofErr w:type="spellEnd"/>
-            <w:r>
-              <w:rPr>
-                <w:lang w:val="en-US"/>
-              </w:rPr>
-              <w:t xml:space="preserve"> (PK) </w:t>
+            <w:r>
+              <w:rPr>
+                <w:lang w:val="en-US"/>
+              </w:rPr>
+              <w:t xml:space="preserve">churn_id (PK) </w:t>
             </w:r>
             <w:r>
               <w:rPr>
@@ -1206,21 +936,7 @@
               <w:rPr>
                 <w:lang w:val="en-US"/>
               </w:rPr>
-              <w:t xml:space="preserve"> </w:t>
-            </w:r>
-            <w:proofErr w:type="spellStart"/>
-            <w:r>
-              <w:rPr>
-                <w:lang w:val="en-US"/>
-              </w:rPr>
-              <w:t>user_id</w:t>
-            </w:r>
-            <w:proofErr w:type="spellEnd"/>
-            <w:r>
-              <w:rPr>
-                <w:lang w:val="en-US"/>
-              </w:rPr>
-              <w:t xml:space="preserve"> (FK) </w:t>
+              <w:t xml:space="preserve"> user_id (FK) </w:t>
             </w:r>
             <w:r>
               <w:rPr>
@@ -1287,21 +1003,7 @@
         <w:rPr>
           <w:lang w:val="en-US"/>
         </w:rPr>
-        <w:t>env file using python-</w:t>
-      </w:r>
-      <w:proofErr w:type="spellStart"/>
-      <w:r>
-        <w:rPr>
-          <w:lang w:val="en-US"/>
-        </w:rPr>
-        <w:t>dotenv</w:t>
-      </w:r>
-      <w:proofErr w:type="spellEnd"/>
-      <w:r>
-        <w:rPr>
-          <w:lang w:val="en-US"/>
-        </w:rPr>
-        <w:t>, keeping sensitive information out of the codebase.</w:t>
+        <w:t>env file using python-dotenv, keeping sensitive information out of the codebase.</w:t>
       </w:r>
     </w:p>
     <w:p>
@@ -1394,29 +1096,7 @@
         <w:rPr>
           <w:lang w:val="en-US"/>
         </w:rPr>
-        <w:t xml:space="preserve">The .env file stores all credentials locally and is never committed to version control (added </w:t>
-      </w:r>
-      <w:proofErr w:type="gramStart"/>
-      <w:r>
-        <w:rPr>
-          <w:lang w:val="en-US"/>
-        </w:rPr>
-        <w:t>to .</w:t>
-      </w:r>
-      <w:proofErr w:type="spellStart"/>
-      <w:r>
-        <w:rPr>
-          <w:lang w:val="en-US"/>
-        </w:rPr>
-        <w:t>gitignore</w:t>
-      </w:r>
-      <w:proofErr w:type="spellEnd"/>
-      <w:proofErr w:type="gramEnd"/>
-      <w:r>
-        <w:rPr>
-          <w:lang w:val="en-US"/>
-        </w:rPr>
-        <w:t>). It follows this structure:</w:t>
+        <w:t>The .env file stores all credentials locally and is never committed to version control (added to .gitignore). It follows this structure:</w:t>
       </w:r>
     </w:p>
     <w:p>
@@ -1489,35 +1169,7 @@
         <w:rPr>
           <w:lang w:val="en-US"/>
         </w:rPr>
-        <w:t xml:space="preserve">, the connection was upgraded to </w:t>
-      </w:r>
-      <w:proofErr w:type="spellStart"/>
-      <w:r>
-        <w:rPr>
-          <w:lang w:val="en-US"/>
-        </w:rPr>
-        <w:t>SQLAlchemy</w:t>
-      </w:r>
-      <w:proofErr w:type="spellEnd"/>
-      <w:r>
-        <w:rPr>
-          <w:lang w:val="en-US"/>
-        </w:rPr>
-        <w:t xml:space="preserve"> to avoid a pandas deprecation warning with raw psycopg2 connections. The </w:t>
-      </w:r>
-      <w:proofErr w:type="gramStart"/>
-      <w:r>
-        <w:rPr>
-          <w:lang w:val="en-US"/>
-        </w:rPr>
-        <w:t>same .env</w:t>
-      </w:r>
-      <w:proofErr w:type="gramEnd"/>
-      <w:r>
-        <w:rPr>
-          <w:lang w:val="en-US"/>
-        </w:rPr>
-        <w:t xml:space="preserve"> credentials were reused:</w:t>
+        <w:t>, the connection was upgraded to SQLAlchemy to avoid a pandas deprecation warning with raw psycopg2 connections. The same .env credentials were reused:</w:t>
       </w:r>
     </w:p>
     <w:p>
@@ -1613,96 +1265,26 @@
           <w:lang w:val="en-US"/>
         </w:rPr>
       </w:pPr>
-      <w:proofErr w:type="spellStart"/>
       <w:r>
         <w:rPr>
           <w:b/>
           <w:bCs/>
           <w:lang w:val="en-US"/>
         </w:rPr>
-        <w:t>create_</w:t>
-      </w:r>
-      <w:proofErr w:type="gramStart"/>
-      <w:r>
-        <w:rPr>
-          <w:b/>
-          <w:bCs/>
-          <w:lang w:val="en-US"/>
-        </w:rPr>
-        <w:t>table</w:t>
-      </w:r>
-      <w:proofErr w:type="spellEnd"/>
-      <w:r>
-        <w:rPr>
-          <w:b/>
-          <w:bCs/>
-          <w:lang w:val="en-US"/>
-        </w:rPr>
-        <w:t>(</w:t>
-      </w:r>
-      <w:proofErr w:type="gramEnd"/>
-      <w:r>
-        <w:rPr>
-          <w:b/>
-          <w:bCs/>
-          <w:lang w:val="en-US"/>
-        </w:rPr>
-        <w:t>)</w:t>
-      </w:r>
-    </w:p>
-    <w:p>
-      <w:pPr>
-        <w:rPr>
-          <w:lang w:val="en-US"/>
-        </w:rPr>
-      </w:pPr>
-      <w:r>
-        <w:rPr>
-          <w:lang w:val="en-US"/>
-        </w:rPr>
-        <w:t xml:space="preserve">The </w:t>
-      </w:r>
-      <w:proofErr w:type="spellStart"/>
-      <w:r>
-        <w:rPr>
-          <w:lang w:val="en-US"/>
-        </w:rPr>
-        <w:t>create_</w:t>
-      </w:r>
-      <w:proofErr w:type="gramStart"/>
-      <w:r>
-        <w:rPr>
-          <w:lang w:val="en-US"/>
-        </w:rPr>
-        <w:t>table</w:t>
-      </w:r>
-      <w:proofErr w:type="spellEnd"/>
-      <w:r>
-        <w:rPr>
-          <w:lang w:val="en-US"/>
-        </w:rPr>
-        <w:t>(</w:t>
-      </w:r>
-      <w:proofErr w:type="gramEnd"/>
-      <w:r>
-        <w:rPr>
-          <w:lang w:val="en-US"/>
-        </w:rPr>
-        <w:t xml:space="preserve">) function runs a single SQL statement using psycopg2 that creates all 6 tables at once, using CREATE TABLE IF NOT EXISIST to make it safe to run multiple times without errors. It is called automatically at the start of </w:t>
-      </w:r>
-      <w:proofErr w:type="gramStart"/>
-      <w:r>
-        <w:rPr>
-          <w:lang w:val="en-US"/>
-        </w:rPr>
-        <w:t>main(</w:t>
-      </w:r>
-      <w:proofErr w:type="gramEnd"/>
-      <w:r>
-        <w:rPr>
-          <w:lang w:val="en-US"/>
-        </w:rPr>
-        <w:t>) before any data is inserted.</w:t>
+        <w:t>create_table()</w:t>
+      </w:r>
+    </w:p>
+    <w:p>
+      <w:pPr>
+        <w:rPr>
+          <w:lang w:val="en-US"/>
+        </w:rPr>
+      </w:pPr>
+      <w:r>
+        <w:rPr>
+          <w:lang w:val="en-US"/>
+        </w:rPr>
+        <w:t>The create_table() function runs a single SQL statement using psycopg2 that creates all 6 tables at once, using CREATE TABLE IF NOT EXISIST to make it safe to run multiple times without errors. It is called automatically at the start of main() before any data is inserted.</w:t>
       </w:r>
     </w:p>
     <w:p>
@@ -1783,21 +1365,7 @@
         <w:rPr>
           <w:lang w:val="en-US"/>
         </w:rPr>
-        <w:t xml:space="preserve">The </w:t>
-      </w:r>
-      <w:proofErr w:type="gramStart"/>
-      <w:r>
-        <w:rPr>
-          <w:lang w:val="en-US"/>
-        </w:rPr>
-        <w:t>main(</w:t>
-      </w:r>
-      <w:proofErr w:type="gramEnd"/>
-      <w:r>
-        <w:rPr>
-          <w:lang w:val="en-US"/>
-        </w:rPr>
-        <w:t>) function orchestrates the full setup in order – connection, creating tables, seeding data, and committing – with a rollback on any error:</w:t>
+        <w:t>The main() function orchestrates the full setup in order – connection, creating tables, seeding data, and committing – with a rollback on any error:</w:t>
       </w:r>
     </w:p>
     <w:p>
@@ -1931,21 +1499,7 @@
         <w:rPr>
           <w:lang w:val="en-US"/>
         </w:rPr>
-        <w:t xml:space="preserve">Generates user data (age, country, </w:t>
-      </w:r>
-      <w:proofErr w:type="spellStart"/>
-      <w:r>
-        <w:rPr>
-          <w:lang w:val="en-US"/>
-        </w:rPr>
-        <w:t>signup_date</w:t>
-      </w:r>
-      <w:proofErr w:type="spellEnd"/>
-      <w:r>
-        <w:rPr>
-          <w:lang w:val="en-US"/>
-        </w:rPr>
-        <w:t>) for all n users first, collecting results in a list.</w:t>
+        <w:t>Generates user data (age, country, signup_date) for all n users first, collecting results in a list.</w:t>
       </w:r>
     </w:p>
     <w:p>
@@ -1963,21 +1517,7 @@
         <w:rPr>
           <w:lang w:val="en-US"/>
         </w:rPr>
-        <w:t xml:space="preserve">Inserts all users in a single batch call using </w:t>
-      </w:r>
-      <w:proofErr w:type="spellStart"/>
-      <w:r>
-        <w:rPr>
-          <w:lang w:val="en-US"/>
-        </w:rPr>
-        <w:t>execute_values</w:t>
-      </w:r>
-      <w:proofErr w:type="spellEnd"/>
-      <w:r>
-        <w:rPr>
-          <w:lang w:val="en-US"/>
-        </w:rPr>
-        <w:t xml:space="preserve"> – much faster than inserting one row at a time.</w:t>
+        <w:t>Inserts all users in a single batch call using execute_values – much faster than inserting one row at a time.</w:t>
       </w:r>
     </w:p>
     <w:p>
@@ -1995,35 +1535,7 @@
         <w:rPr>
           <w:lang w:val="en-US"/>
         </w:rPr>
-        <w:t xml:space="preserve">Retrieves all generates </w:t>
-      </w:r>
-      <w:proofErr w:type="spellStart"/>
-      <w:r>
-        <w:rPr>
-          <w:lang w:val="en-US"/>
-        </w:rPr>
-        <w:t>user_ids</w:t>
-      </w:r>
-      <w:proofErr w:type="spellEnd"/>
-      <w:r>
-        <w:rPr>
-          <w:lang w:val="en-US"/>
-        </w:rPr>
-        <w:t xml:space="preserve"> using RETURNING </w:t>
-      </w:r>
-      <w:proofErr w:type="spellStart"/>
-      <w:r>
-        <w:rPr>
-          <w:lang w:val="en-US"/>
-        </w:rPr>
-        <w:t>user_id</w:t>
-      </w:r>
-      <w:proofErr w:type="spellEnd"/>
-      <w:r>
-        <w:rPr>
-          <w:lang w:val="en-US"/>
-        </w:rPr>
-        <w:t>, then builds related records for all 5 other tables.</w:t>
+        <w:t>Retrieves all generates user_ids using RETURNING user_id, then builds related records for all 5 other tables.</w:t>
       </w:r>
     </w:p>
     <w:p>
@@ -2163,85 +1675,7 @@
         <w:rPr>
           <w:lang w:val="en-US"/>
         </w:rPr>
-        <w:t xml:space="preserve">EDA was conducted in a </w:t>
-      </w:r>
-      <w:proofErr w:type="spellStart"/>
-      <w:r>
-        <w:rPr>
-          <w:lang w:val="en-US"/>
-        </w:rPr>
-        <w:t>Jupyter</w:t>
-      </w:r>
-      <w:proofErr w:type="spellEnd"/>
-      <w:r>
-        <w:rPr>
-          <w:lang w:val="en-US"/>
-        </w:rPr>
-        <w:t xml:space="preserve"> Notebook using pandas, seaborn, and matplotlib. Data was loaded from PostgreSQL using </w:t>
-      </w:r>
-      <w:proofErr w:type="spellStart"/>
-      <w:r>
-        <w:rPr>
-          <w:lang w:val="en-US"/>
-        </w:rPr>
-        <w:t>SQLAlchemy</w:t>
-      </w:r>
-      <w:proofErr w:type="spellEnd"/>
-      <w:r>
-        <w:rPr>
-          <w:lang w:val="en-US"/>
-        </w:rPr>
-        <w:t xml:space="preserve"> and </w:t>
-      </w:r>
-      <w:proofErr w:type="spellStart"/>
-      <w:proofErr w:type="gramStart"/>
-      <w:r>
-        <w:rPr>
-          <w:lang w:val="en-US"/>
-        </w:rPr>
-        <w:t>pd.read</w:t>
-      </w:r>
-      <w:proofErr w:type="gramEnd"/>
-      <w:r>
-        <w:rPr>
-          <w:lang w:val="en-US"/>
-        </w:rPr>
-        <w:t>_sql</w:t>
-      </w:r>
-      <w:proofErr w:type="spellEnd"/>
-      <w:r>
-        <w:rPr>
-          <w:lang w:val="en-US"/>
-        </w:rPr>
-        <w:t xml:space="preserve">, joining all 6 tables into a single flat </w:t>
-      </w:r>
-      <w:proofErr w:type="spellStart"/>
-      <w:r>
-        <w:rPr>
-          <w:lang w:val="en-US"/>
-        </w:rPr>
-        <w:t>dataframe</w:t>
-      </w:r>
-      <w:proofErr w:type="spellEnd"/>
-      <w:r>
-        <w:rPr>
-          <w:lang w:val="en-US"/>
-        </w:rPr>
-        <w:t xml:space="preserve"> on </w:t>
-      </w:r>
-      <w:proofErr w:type="spellStart"/>
-      <w:r>
-        <w:rPr>
-          <w:lang w:val="en-US"/>
-        </w:rPr>
-        <w:t>user_id</w:t>
-      </w:r>
-      <w:proofErr w:type="spellEnd"/>
-      <w:r>
-        <w:rPr>
-          <w:lang w:val="en-US"/>
-        </w:rPr>
-        <w:t>.</w:t>
+        <w:t>EDA was conducted in a Jupyter Notebook using pandas, seaborn, and matplotlib. Data was loaded from PostgreSQL using SQLAlchemy and pd.read_sql, joining all 6 tables into a single flat dataframe on user_id.</w:t>
       </w:r>
     </w:p>
     <w:p>
@@ -2322,85 +1756,7 @@
         <w:rPr>
           <w:lang w:val="en-US"/>
         </w:rPr>
-        <w:t>After loading the data, the DATE columns (</w:t>
-      </w:r>
-      <w:proofErr w:type="spellStart"/>
-      <w:r>
-        <w:rPr>
-          <w:lang w:val="en-US"/>
-        </w:rPr>
-        <w:t>signup_date</w:t>
-      </w:r>
-      <w:proofErr w:type="spellEnd"/>
-      <w:r>
-        <w:rPr>
-          <w:lang w:val="en-US"/>
-        </w:rPr>
-        <w:t xml:space="preserve"> and </w:t>
-      </w:r>
-      <w:proofErr w:type="spellStart"/>
-      <w:r>
-        <w:rPr>
-          <w:lang w:val="en-US"/>
-        </w:rPr>
-        <w:t>start_date</w:t>
-      </w:r>
-      <w:proofErr w:type="spellEnd"/>
-      <w:r>
-        <w:rPr>
-          <w:lang w:val="en-US"/>
-        </w:rPr>
-        <w:t xml:space="preserve">) were read as object </w:t>
-      </w:r>
-      <w:proofErr w:type="spellStart"/>
-      <w:r>
-        <w:rPr>
-          <w:lang w:val="en-US"/>
-        </w:rPr>
-        <w:t>dtype</w:t>
-      </w:r>
-      <w:proofErr w:type="spellEnd"/>
-      <w:r>
-        <w:rPr>
-          <w:lang w:val="en-US"/>
-        </w:rPr>
-        <w:t xml:space="preserve"> instead of datetime. This is a known </w:t>
-      </w:r>
-      <w:proofErr w:type="spellStart"/>
-      <w:r>
-        <w:rPr>
-          <w:lang w:val="en-US"/>
-        </w:rPr>
-        <w:t>behaviour</w:t>
-      </w:r>
-      <w:proofErr w:type="spellEnd"/>
-      <w:r>
-        <w:rPr>
-          <w:lang w:val="en-US"/>
-        </w:rPr>
-        <w:t xml:space="preserve"> when loading date columns via </w:t>
-      </w:r>
-      <w:proofErr w:type="spellStart"/>
-      <w:proofErr w:type="gramStart"/>
-      <w:r>
-        <w:rPr>
-          <w:lang w:val="en-US"/>
-        </w:rPr>
-        <w:t>pd.read</w:t>
-      </w:r>
-      <w:proofErr w:type="gramEnd"/>
-      <w:r>
-        <w:rPr>
-          <w:lang w:val="en-US"/>
-        </w:rPr>
-        <w:t>_sql</w:t>
-      </w:r>
-      <w:proofErr w:type="spellEnd"/>
-      <w:r>
-        <w:rPr>
-          <w:lang w:val="en-US"/>
-        </w:rPr>
-        <w:t xml:space="preserve"> – pandas does not automatically infer date types from PostgreSQL DATE fields. They were converted manually after loading:</w:t>
+        <w:t>After loading the data, the DATE columns (signup_date and start_date) were read as object dtype instead of datetime. This is a known behaviour when loading date columns via pd.read_sql – pandas does not automatically infer date types from PostgreSQL DATE fields. They were converted manually after loading:</w:t>
       </w:r>
     </w:p>
     <w:p>
@@ -2645,21 +2001,7 @@
         <w:rPr>
           <w:lang w:val="en-US"/>
         </w:rPr>
-        <w:t xml:space="preserve">72/28 split is a healthy imbalance. When modeling, </w:t>
-      </w:r>
-      <w:proofErr w:type="spellStart"/>
-      <w:r>
-        <w:rPr>
-          <w:lang w:val="en-US"/>
-        </w:rPr>
-        <w:t>class_weight</w:t>
-      </w:r>
-      <w:proofErr w:type="spellEnd"/>
-      <w:r>
-        <w:rPr>
-          <w:lang w:val="en-US"/>
-        </w:rPr>
-        <w:t>=’balanced’ and stratified k-fold cross validation will be used to handle it correctly. Evaluation will focus on F1-score, precision, and recall rather than raw accuracy.</w:t>
+        <w:t>72/28 split is a healthy imbalance. When modeling, class_weight=’balanced’ and stratified k-fold cross validation will be used to handle it correctly. Evaluation will focus on F1-score, precision, and recall rather than raw accuracy.</w:t>
       </w:r>
     </w:p>
     <w:p>
@@ -2759,47 +2101,7 @@
           <w:bCs/>
           <w:lang w:val="en-US"/>
         </w:rPr>
-        <w:t xml:space="preserve">expected given that the data was generated using </w:t>
-      </w:r>
-      <w:proofErr w:type="spellStart"/>
-      <w:proofErr w:type="gramStart"/>
-      <w:r>
-        <w:rPr>
-          <w:b/>
-          <w:bCs/>
-          <w:lang w:val="en-US"/>
-        </w:rPr>
-        <w:t>random.uniform</w:t>
-      </w:r>
-      <w:proofErr w:type="spellEnd"/>
-      <w:proofErr w:type="gramEnd"/>
-      <w:r>
-        <w:rPr>
-          <w:b/>
-          <w:bCs/>
-          <w:lang w:val="en-US"/>
-        </w:rPr>
-        <w:t xml:space="preserve"> and </w:t>
-      </w:r>
-      <w:proofErr w:type="spellStart"/>
-      <w:proofErr w:type="gramStart"/>
-      <w:r>
-        <w:rPr>
-          <w:b/>
-          <w:bCs/>
-          <w:lang w:val="en-US"/>
-        </w:rPr>
-        <w:t>random.randint</w:t>
-      </w:r>
-      <w:proofErr w:type="spellEnd"/>
-      <w:proofErr w:type="gramEnd"/>
-      <w:r>
-        <w:rPr>
-          <w:b/>
-          <w:bCs/>
-          <w:lang w:val="en-US"/>
-        </w:rPr>
-        <w:t>.</w:t>
+        <w:t>expected given that the data was generated using random.uniform and random.randint.</w:t>
       </w:r>
       <w:r>
         <w:rPr>
@@ -2831,23 +2133,7 @@
         <w:rPr>
           <w:lang w:val="en-US"/>
         </w:rPr>
-        <w:t xml:space="preserve">Evenly distributed across all 13 countries (~385 each) and all 3 plans (~1,667 each), as expected from </w:t>
-      </w:r>
-      <w:proofErr w:type="spellStart"/>
-      <w:proofErr w:type="gramStart"/>
-      <w:r>
-        <w:rPr>
-          <w:lang w:val="en-US"/>
-        </w:rPr>
-        <w:t>random.choice</w:t>
-      </w:r>
-      <w:proofErr w:type="spellEnd"/>
-      <w:proofErr w:type="gramEnd"/>
-      <w:r>
-        <w:rPr>
-          <w:lang w:val="en-US"/>
-        </w:rPr>
-        <w:t>.</w:t>
+        <w:t>Evenly distributed across all 13 countries (~385 each) and all 3 plans (~1,667 each), as expected from random.choice.</w:t>
       </w:r>
       <w:r>
         <w:rPr>
@@ -3062,77 +2348,13 @@
         <w:rPr>
           <w:lang w:val="en-US"/>
         </w:rPr>
-        <w:t xml:space="preserve">aration on </w:t>
-      </w:r>
-      <w:proofErr w:type="spellStart"/>
-      <w:r>
-        <w:rPr>
-          <w:lang w:val="en-US"/>
-        </w:rPr>
-        <w:t>days_since_last_watch</w:t>
-      </w:r>
-      <w:proofErr w:type="spellEnd"/>
-      <w:r>
-        <w:rPr>
-          <w:lang w:val="en-US"/>
-        </w:rPr>
-        <w:t xml:space="preserve">, which is the strongest visual predictor – churned users had a noticeably higher median. All other features (age, </w:t>
-      </w:r>
-      <w:proofErr w:type="spellStart"/>
-      <w:r>
-        <w:rPr>
-          <w:lang w:val="en-US"/>
-        </w:rPr>
-        <w:t>watch_hours</w:t>
-      </w:r>
-      <w:proofErr w:type="spellEnd"/>
-      <w:r>
-        <w:rPr>
-          <w:lang w:val="en-US"/>
-        </w:rPr>
-        <w:t xml:space="preserve">, logins, </w:t>
-      </w:r>
-      <w:proofErr w:type="spellStart"/>
-      <w:r>
-        <w:rPr>
-          <w:lang w:val="en-US"/>
-        </w:rPr>
-        <w:t>completion_rate</w:t>
-      </w:r>
-      <w:proofErr w:type="spellEnd"/>
-      <w:r>
-        <w:rPr>
-          <w:lang w:val="en-US"/>
-        </w:rPr>
-        <w:t xml:space="preserve">, </w:t>
-      </w:r>
-      <w:proofErr w:type="spellStart"/>
-      <w:r>
-        <w:rPr>
-          <w:lang w:val="en-US"/>
-        </w:rPr>
-        <w:t>monthly_price</w:t>
-      </w:r>
-      <w:proofErr w:type="spellEnd"/>
-      <w:r>
-        <w:rPr>
-          <w:lang w:val="en-US"/>
-        </w:rPr>
-        <w:t xml:space="preserve">, </w:t>
-      </w:r>
-      <w:proofErr w:type="spellStart"/>
-      <w:r>
-        <w:rPr>
-          <w:lang w:val="en-US"/>
-        </w:rPr>
-        <w:t>payment_failures</w:t>
-      </w:r>
-      <w:proofErr w:type="spellEnd"/>
-      <w:r>
-        <w:rPr>
-          <w:lang w:val="en-US"/>
-        </w:rPr>
-        <w:t>) showed heavily overlapping distributions with no meaningful separation, indicating they are weak individual predictors on their own.</w:t>
+        <w:t xml:space="preserve">aration on days_since_last_watch, which is the strongest visual predictor – churned users had a noticeably higher median. All other features (age, watch_hours, logins, completion_rate, monthly_price, </w:t>
+      </w:r>
+      <w:r>
+        <w:rPr>
+          <w:lang w:val="en-US"/>
+        </w:rPr>
+        <w:t>payment_failures) showed heavily overlapping distributions with no meaningful separation, indicating they are weak individual predictors on their own.</w:t>
       </w:r>
     </w:p>
     <w:p>
@@ -3446,14 +2668,12 @@
                 <w:lang w:val="en-US"/>
               </w:rPr>
             </w:pPr>
-            <w:proofErr w:type="spellStart"/>
             <w:r>
               <w:rPr>
                 <w:lang w:val="en-US"/>
               </w:rPr>
               <w:t>Strengh</w:t>
             </w:r>
-            <w:proofErr w:type="spellEnd"/>
           </w:p>
         </w:tc>
       </w:tr>
@@ -3472,14 +2692,12 @@
                 <w:lang w:val="en-US"/>
               </w:rPr>
             </w:pPr>
-            <w:proofErr w:type="spellStart"/>
             <w:r>
               <w:rPr>
                 <w:lang w:val="en-US"/>
               </w:rPr>
               <w:t>days_since_last_watch</w:t>
             </w:r>
-            <w:proofErr w:type="spellEnd"/>
           </w:p>
         </w:tc>
         <w:tc>
@@ -3535,14 +2753,12 @@
                 <w:lang w:val="en-US"/>
               </w:rPr>
             </w:pPr>
-            <w:proofErr w:type="spellStart"/>
             <w:r>
               <w:rPr>
                 <w:lang w:val="en-US"/>
               </w:rPr>
               <w:t>avg_watch_hours_per_week</w:t>
             </w:r>
-            <w:proofErr w:type="spellEnd"/>
           </w:p>
         </w:tc>
         <w:tc>
@@ -3599,14 +2815,12 @@
                 <w:lang w:val="en-US"/>
               </w:rPr>
             </w:pPr>
-            <w:proofErr w:type="spellStart"/>
             <w:r>
               <w:rPr>
                 <w:lang w:val="en-US"/>
               </w:rPr>
               <w:t>payment_failures</w:t>
             </w:r>
-            <w:proofErr w:type="spellEnd"/>
           </w:p>
         </w:tc>
         <w:tc>
@@ -3660,14 +2874,12 @@
                 <w:lang w:val="en-US"/>
               </w:rPr>
             </w:pPr>
-            <w:proofErr w:type="spellStart"/>
             <w:r>
               <w:rPr>
                 <w:lang w:val="en-US"/>
               </w:rPr>
               <w:t>number_of_logins_per_week</w:t>
             </w:r>
-            <w:proofErr w:type="spellEnd"/>
           </w:p>
         </w:tc>
         <w:tc>
@@ -3783,14 +2995,12 @@
                 <w:lang w:val="en-US"/>
               </w:rPr>
             </w:pPr>
-            <w:proofErr w:type="spellStart"/>
             <w:r>
               <w:rPr>
                 <w:lang w:val="en-US"/>
               </w:rPr>
               <w:t>monthly_price</w:t>
             </w:r>
-            <w:proofErr w:type="spellEnd"/>
           </w:p>
         </w:tc>
         <w:tc>
@@ -3847,14 +3057,12 @@
                 <w:lang w:val="en-US"/>
               </w:rPr>
             </w:pPr>
-            <w:proofErr w:type="spellStart"/>
             <w:r>
               <w:rPr>
                 <w:lang w:val="en-US"/>
               </w:rPr>
               <w:t>completion_rate</w:t>
             </w:r>
-            <w:proofErr w:type="spellEnd"/>
           </w:p>
         </w:tc>
         <w:tc>
@@ -3934,19 +3142,11 @@
           <w:lang w:val="en-US"/>
         </w:rPr>
       </w:pPr>
-      <w:proofErr w:type="spellStart"/>
-      <w:r>
-        <w:rPr>
-          <w:lang w:val="en-US"/>
-        </w:rPr>
-        <w:t>days_since_last_watch</w:t>
-      </w:r>
-      <w:proofErr w:type="spellEnd"/>
-      <w:r>
-        <w:rPr>
-          <w:lang w:val="en-US"/>
-        </w:rPr>
-        <w:t xml:space="preserve"> is by far the strongest predictor of churn (r = </w:t>
+      <w:r>
+        <w:rPr>
+          <w:lang w:val="en-US"/>
+        </w:rPr>
+        <w:t xml:space="preserve">days_since_last_watch is by far the strongest predictor of churn (r = </w:t>
       </w:r>
       <w:r>
         <w:rPr>
@@ -3976,21 +3176,7 @@
         <w:rPr>
           <w:lang w:val="en-US"/>
         </w:rPr>
-        <w:t xml:space="preserve">they are useless – non-linear models like Random Forest and </w:t>
-      </w:r>
-      <w:proofErr w:type="spellStart"/>
-      <w:r>
-        <w:rPr>
-          <w:lang w:val="en-US"/>
-        </w:rPr>
-        <w:t>XGBoost</w:t>
-      </w:r>
-      <w:proofErr w:type="spellEnd"/>
-      <w:r>
-        <w:rPr>
-          <w:lang w:val="en-US"/>
-        </w:rPr>
-        <w:t xml:space="preserve"> can capture interaction effects between features that Pearson correlation misses.</w:t>
+        <w:t>they are useless – non-linear models like Random Forest and XGBoost can capture interaction effects between features that Pearson correlation misses.</w:t>
       </w:r>
     </w:p>
     <w:p>
@@ -4116,7 +3302,6 @@
           <w:lang w:val="en-US"/>
         </w:rPr>
       </w:pPr>
-      <w:proofErr w:type="spellStart"/>
       <w:r>
         <w:rPr>
           <w:b/>
@@ -4126,7 +3311,6 @@
         </w:rPr>
         <w:t>tenure_days</w:t>
       </w:r>
-      <w:proofErr w:type="spellEnd"/>
     </w:p>
     <w:p>
       <w:pPr>
@@ -4192,21 +3376,7 @@
         <w:rPr>
           <w:lang w:val="en-US"/>
         </w:rPr>
-        <w:t xml:space="preserve"> earlier – without that conversion this calculation would fail with a </w:t>
-      </w:r>
-      <w:proofErr w:type="spellStart"/>
-      <w:r>
-        <w:rPr>
-          <w:lang w:val="en-US"/>
-        </w:rPr>
-        <w:t>TypeError</w:t>
-      </w:r>
-      <w:proofErr w:type="spellEnd"/>
-      <w:r>
-        <w:rPr>
-          <w:lang w:val="en-US"/>
-        </w:rPr>
-        <w:t xml:space="preserve">. Tenure captures loyalty: long-standing </w:t>
+        <w:t xml:space="preserve"> earlier – without that conversion this calculation would fail with a TypeError. Tenure captures loyalty: long-standing </w:t>
       </w:r>
       <w:r>
         <w:rPr>
@@ -4279,7 +3449,6 @@
           <w:lang w:val="en-US"/>
         </w:rPr>
       </w:pPr>
-      <w:proofErr w:type="spellStart"/>
       <w:r>
         <w:rPr>
           <w:b/>
@@ -4289,7 +3458,6 @@
         </w:rPr>
         <w:t>engagement_score</w:t>
       </w:r>
-      <w:proofErr w:type="spellEnd"/>
     </w:p>
     <w:p>
       <w:pPr>
@@ -4385,7 +3553,6 @@
           <w:lang w:val="en-US"/>
         </w:rPr>
       </w:pPr>
-      <w:proofErr w:type="spellStart"/>
       <w:r>
         <w:rPr>
           <w:b/>
@@ -4395,7 +3562,6 @@
         </w:rPr>
         <w:t>is_inactive</w:t>
       </w:r>
-      <w:proofErr w:type="spellEnd"/>
     </w:p>
     <w:p>
       <w:pPr>
@@ -4461,21 +3627,7 @@
         <w:rPr>
           <w:lang w:val="en-US"/>
         </w:rPr>
-        <w:t xml:space="preserve">analysis – </w:t>
-      </w:r>
-      <w:proofErr w:type="spellStart"/>
-      <w:r>
-        <w:rPr>
-          <w:lang w:val="en-US"/>
-        </w:rPr>
-        <w:t>days_since_last_watch</w:t>
-      </w:r>
-      <w:proofErr w:type="spellEnd"/>
-      <w:r>
-        <w:rPr>
-          <w:lang w:val="en-US"/>
-        </w:rPr>
-        <w:t xml:space="preserve"> had the highest correlation with churn at r=+0.37</w:t>
+        <w:t>analysis – days_since_last_watch had the highest correlation with churn at r=+0.37</w:t>
       </w:r>
       <w:r>
         <w:rPr>
@@ -4487,23 +3639,7 @@
         <w:rPr>
           <w:lang w:val="en-US"/>
         </w:rPr>
-        <w:t xml:space="preserve">benefits from this because it might otherwise struggle to find the right cutoff on a </w:t>
-      </w:r>
-      <w:proofErr w:type="spellStart"/>
-      <w:proofErr w:type="gramStart"/>
-      <w:r>
-        <w:rPr>
-          <w:lang w:val="en-US"/>
-        </w:rPr>
-        <w:t>continuos</w:t>
-      </w:r>
-      <w:proofErr w:type="spellEnd"/>
-      <w:proofErr w:type="gramEnd"/>
-      <w:r>
-        <w:rPr>
-          <w:lang w:val="en-US"/>
-        </w:rPr>
-        <w:t xml:space="preserve"> variable on its own. 4</w:t>
+        <w:t>benefits from this because it might otherwise struggle to find the right cutoff on a continuos variable on its own. 4</w:t>
       </w:r>
       <w:r>
         <w:rPr>

</xml_diff>